<commit_message>
Add requirements, RTM, SRS, WBS and architecture specification
1-RE: 7 FRs and 5 NFRs with a traceability matrix to use cases, Jira
stories, components, work packages, tests and Jira bugs.
2-Architectural_Diagram: specification, folder README, diagram script, and
requirement numbers updated in the diagram and justification.
4-SRS_and_Work_Breakdown_Steps: SRS, WBS, schedule chart.
Root README with the deliverable map.

Co-Authored-By: Claude Opus 5.5 <noreply@anthropic.com>
Claude-Session: https://claude.ai/code/session_01C71evT6k77WvQRr8hJmYZN
</commit_message>
<xml_diff>
--- a/2-Architectural_Diagram/Architecture_Justification_Document.docx
+++ b/2-Architectural_Diagram/Architecture_Justification_Document.docx
@@ -417,7 +417,7 @@
           <w:sz w:val="21"/>
           <w:szCs w:val="21"/>
         </w:rPr>
-        <w:t xml:space="preserve">When a new cohort opens, thousands of citizens book at the same moment (NFR-002: 5,000 concurrent booking requests, 95% answered within 3 s). Dose recording and certificate checks stay at their normal volume. With microservices we add instances of only the Slot Booking Service for the rollout window, instead of copying the whole system.</w:t>
+        <w:t xml:space="preserve">When a new cohort opens, thousands of citizens book at the same moment (NFR-003: 5,000 concurrent booking requests, 95% answered within 3 s). Dose recording and certificate checks stay at their normal volume. With microservices we add instances of only the Slot Booking Service for the rollout window, instead of copying the whole system.</w:t>
       </w:r>
     </w:p>
     <w:p>
@@ -481,7 +481,7 @@
           <w:sz w:val="21"/>
           <w:szCs w:val="21"/>
         </w:rPr>
-        <w:t xml:space="preserve">The private key that signs QR certificates is held only inside the Certificate Service. The public-facing services (registration and booking) and their databases have no access to it, so an attacker who breaks into the booking service still cannot forge a vaccination certificate. All outside traffic also enters through the API Gateway, which checks the login token and the role (citizen or officer) before any service is reached.</w:t>
+        <w:t xml:space="preserve">The private key that signs QR certificates is held only inside the Certificate Service. The public-facing services (registration and booking) and their databases have no access to it, so an attacker who breaks into the booking service still cannot forge a vaccination certificate. All outside traffic also enters through the API Gateway, which checks the login token and the role (citizen or officer) before any service is reached, as NFR-002 requires.</w:t>
       </w:r>
     </w:p>
     <w:p>
@@ -561,7 +561,7 @@
           <w:sz w:val="19"/>
           <w:szCs w:val="19"/>
         </w:rPr>
-        <w:t xml:space="preserve">Diagram: uml_component_diagram.pdf shows 8 components, 4 per-service data stores and 10 interfaces in ball-and-socket notation.</w:t>
+        <w:t xml:space="preserve">Diagram: Architecture_Diagram.pdf shows 8 components, 4 per-service data stores and 10 interfaces in ball-and-socket notation.</w:t>
       </w:r>
     </w:p>
     <w:sectPr>

</xml_diff>